<commit_message>
Fix paper: embed Figure 2, correct mechanism, honest DRC description, updated volcano interpretation
</commit_message>
<xml_diff>
--- a/docs/report/CREII_CO2_Methanol_Paper.docx
+++ b/docs/report/CREII_CO2_Methanol_Paper.docx
@@ -8,7 +8,6 @@
       </w:pPr>
       <w:r>
         <w:rPr>
-          <w:rFonts w:ascii="Times New Roman" w:hAnsi="Times New Roman"/>
           <w:b/>
           <w:sz w:val="36"/>
         </w:rPr>
@@ -29,7 +28,7 @@
           <w:b/>
           <w:sz w:val="28"/>
         </w:rPr>
-        <w:t>Harpreet Thappa</w:t>
+        <w:t>Harpreet Thappa  2024BCHE034</w:t>
       </w:r>
     </w:p>
     <w:p>
@@ -84,7 +83,7 @@
           <w:b w:val="0"/>
           <w:i w:val="0"/>
         </w:rPr>
-        <w:t>The hydrogenation of carbon dioxide to methanol represents a strategic route for valorizing captured CO₂ while producing a key platform chemical for the chemical industry. In this work, a multiscale computational study of the CO₂ hydrogenation reaction on Cu-based catalysts has been performed using a hybrid analytical microkinetic and reactor modeling approach. A 13-step Langmuir-Hinshelwood mechanism following the formate pathway was constructed using adsorption energies and activation barriers from published DFT studies. An analytical Langmuir isotherm model was developed to compute surface coverages and turnover frequencies across a two-dimensional descriptor space of CO₂ and H binding energies, including a Sabatier penalty that captures the volcano behavior. The model correctly reproduces the industrial observation that Cu/ZnO is the optimal catalyst for methanol synthesis, predicting it as closest to the volcano peak (TOF = 3.5 × 10³ s⁻¹) with 99.99% selectivity toward methanol. The formate formation step (CO₂* + H* → HCOO*) is identified as the rate-determining step with a Degree of Rate Control of 1.00. Cu/ZnO also exhibits the lowest apparent activation energy (917 meV) among the screened catalysts. A plug-flow reactor model was used to compute realistic per-pass methanol yields, showing that higher pressures and moderate temperatures favor methanol production. This study demonstrates the value of combined microkinetic and reactor modeling for accelerating catalyst screening in sustainable chemical processes.</w:t>
+        <w:t>The hydrogenation of carbon dioxide to methanol represents a strategic route for valorizing captured CO₂ while producing a key platform chemical for the chemical industry. In this work, a multiscale computational study of CO₂ hydrogenation on Cu-based catalysts has been performed using a combined analytical microkinetic and reactor modeling approach. A 13-step Langmuir-Hinshelwood mechanism following the formate pathway was constructed using adsorption energies and activation barriers from published DFT studies. An analytical Langmuir isotherm model was developed to compute surface coverages and turnover frequencies across a two-dimensional descriptor space of CO₂ and H binding energies, incorporating a Brønsted-Evans-Polanyi (BEP) Sabatier penalty that reproduces the volcano behavior. The model correctly reproduces the industrial observation that Cu/ZnO is the optimal catalyst for methanol synthesis, predicting it as closest to the volcano peak (TOF = 3.5 × 10³ s⁻¹) with 99.99% selectivity toward methanol. The formate formation step (CO₂* + H* → HCOO*) is identified as the rate-determining step. Cu/ZnO also exhibits the lowest apparent activation energy (917 meV) among the screened catalysts. A plug-flow reactor model was used to compute realistic per-pass methanol yields, showing that higher pressures and moderate temperatures favor methanol production. This study demonstrates the value of combined microkinetic and reactor modeling for accelerating catalyst screening in sustainable chemical processes.</w:t>
       </w:r>
     </w:p>
     <w:p>
@@ -182,7 +181,7 @@
         <w:pStyle w:val="ListBullet"/>
       </w:pPr>
       <w:r>
-        <w:t xml:space="preserve"> To construct a complete elementary reaction mechanism for CO₂ hydrogenation to methanol on Cu-based catalysts.</w:t>
+        <w:t>To construct a complete elementary reaction mechanism for CO₂ hydrogenation to methanol on Cu-based catalysts.</w:t>
       </w:r>
     </w:p>
     <w:p>
@@ -190,7 +189,7 @@
         <w:pStyle w:val="ListBullet"/>
       </w:pPr>
       <w:r>
-        <w:t xml:space="preserve"> To build a microkinetic model based on the Langmuir-Hinshelwood formalism that captures surface coverages, turnover frequencies, and rate-determining steps.</w:t>
+        <w:t>To build an analytical microkinetic model that captures surface coverages, turnover frequencies, and the rate-determining step.</w:t>
       </w:r>
     </w:p>
     <w:p>
@@ -198,7 +197,7 @@
         <w:pStyle w:val="ListBullet"/>
       </w:pPr>
       <w:r>
-        <w:t xml:space="preserve"> To generate Sabatier volcano plots and identify the optimal descriptor values for maximum methanol production.</w:t>
+        <w:t>To generate Sabatier volcano plots and identify the optimal descriptor values for maximum methanol production.</w:t>
       </w:r>
     </w:p>
     <w:p>
@@ -206,7 +205,7 @@
         <w:pStyle w:val="ListBullet"/>
       </w:pPr>
       <w:r>
-        <w:t xml:space="preserve"> To compare five catalysts (Cu/ZnO, Cu(111), In₂O₃, Pd(111), Ni-Ga) and explain why Cu/ZnO is industrially preferred.</w:t>
+        <w:t>To compare five catalysts (Cu/ZnO, Cu(111), In₂O₃, Pd(111), Ni-Ga) and explain why Cu/ZnO is industrially preferred.</w:t>
       </w:r>
     </w:p>
     <w:p>
@@ -214,7 +213,7 @@
         <w:pStyle w:val="ListBullet"/>
       </w:pPr>
       <w:r>
-        <w:t xml:space="preserve"> To couple the microkinetic model to a plug-flow reactor model and predict realistic per-pass methanol yields.</w:t>
+        <w:t>To couple the microkinetic model to a plug-flow reactor model and predict realistic per-pass methanol yields.</w:t>
       </w:r>
     </w:p>
     <w:p>
@@ -222,7 +221,7 @@
         <w:pStyle w:val="ListBullet"/>
       </w:pPr>
       <w:r>
-        <w:t xml:space="preserve"> To derive design rules that guide the development of next-generation catalysts for CO₂ hydrogenation.</w:t>
+        <w:t>To derive design rules that guide the development of next-generation catalysts for CO₂ hydrogenation.</w:t>
       </w:r>
     </w:p>
     <w:p>
@@ -504,7 +503,7 @@
           <w:b w:val="0"/>
           <w:i w:val="0"/>
         </w:rPr>
-        <w:t>The formate formation step (step 3) is expected to be the rate-determining step based on prior DFT studies and is confirmed by the Degree of Rate Control analysis presented in Section 4.</w:t>
+        <w:t>The formate formation step (step 3) is identified as the rate-determining step based on prior DFT studies and confirmed by the analytical rate expression, which shows the TOF depends explicitly on the formate formation rate constant.</w:t>
       </w:r>
     </w:p>
     <w:p>
@@ -536,13 +535,7 @@
         <w:pStyle w:val="ListBullet"/>
       </w:pPr>
       <w:r>
-        <w:rPr>
-          <w:b/>
-        </w:rPr>
-        <w:t>Language:</w:t>
-      </w:r>
-      <w:r>
-        <w:t xml:space="preserve"> Python 3.13 — primary programming environment.</w:t>
+        <w:t>Python 3.13 — primary programming environment.</w:t>
       </w:r>
     </w:p>
     <w:p>
@@ -550,13 +543,7 @@
         <w:pStyle w:val="ListBullet"/>
       </w:pPr>
       <w:r>
-        <w:rPr>
-          <w:b/>
-        </w:rPr>
-        <w:t>Numerical libraries:</w:t>
-      </w:r>
-      <w:r>
-        <w:t xml:space="preserve"> NumPy and SciPy — numerical computation and optimization.</w:t>
+        <w:t>NumPy and SciPy — numerical computation.</w:t>
       </w:r>
     </w:p>
     <w:p>
@@ -564,13 +551,7 @@
         <w:pStyle w:val="ListBullet"/>
       </w:pPr>
       <w:r>
-        <w:rPr>
-          <w:b/>
-        </w:rPr>
-        <w:t>Reactor modeling:</w:t>
-      </w:r>
-      <w:r>
-        <w:t xml:space="preserve"> Cantera 3.2 — gas-phase thermodynamics and reactor modeling.</w:t>
+        <w:t>Cantera 3.2 — gas-phase thermodynamics and reactor modeling.</w:t>
       </w:r>
     </w:p>
     <w:p>
@@ -578,13 +559,7 @@
         <w:pStyle w:val="ListBullet"/>
       </w:pPr>
       <w:r>
-        <w:rPr>
-          <w:b/>
-        </w:rPr>
-        <w:t>Visualization:</w:t>
-      </w:r>
-      <w:r>
-        <w:t xml:space="preserve"> Matplotlib — generation of publication-quality figures.</w:t>
+        <w:t>Matplotlib — generation of publication-quality figures.</w:t>
       </w:r>
     </w:p>
     <w:p>
@@ -596,7 +571,7 @@
           <w:rFonts w:ascii="Times New Roman" w:hAnsi="Times New Roman"/>
           <w:color w:val="1F3A6E"/>
         </w:rPr>
-        <w:t>3.2 Microkinetic Model</w:t>
+        <w:t>3.2 Analytical Microkinetic Model</w:t>
       </w:r>
     </w:p>
     <w:p>
@@ -605,7 +580,7 @@
           <w:b w:val="0"/>
           <w:i w:val="0"/>
         </w:rPr>
-        <w:t>Surface coverages were computed using the competitive Langmuir adsorption model. For the two primary adsorbates (CO₂ adsorbed molecularly and H₂ dissociating into two H* atoms), the coverages are given by Eqs. 2–4:</w:t>
+        <w:t>Surface coverages were computed using the competitive Langmuir adsorption model. For CO₂ (molecular adsorption) and H₂ (dissociative adsorption into 2 H*), the coverages are given by Eqs. 2–4:</w:t>
       </w:r>
     </w:p>
     <w:p>
@@ -647,7 +622,7 @@
           <w:b w:val="0"/>
           <w:i w:val="0"/>
         </w:rPr>
-        <w:t>where D is the denominator in Eq. 2 and K_i are the adsorption equilibrium constants computed from the adsorption energies via K_i = exp(−ΔG_ads / k_B T). The turnover frequency (TOF) for the rate-determining step was calculated using Eq. 5:</w:t>
+        <w:t>where D is the denominator in Eq. 2, and K_i are the adsorption equilibrium constants computed from the adsorption energies via K_i = exp(−ΔG_ads,i / k_B T). The turnover frequency (TOF) was computed from the rate-determining step (Eq. 5):</w:t>
       </w:r>
     </w:p>
     <w:p>
@@ -667,7 +642,7 @@
           <w:b w:val="0"/>
           <w:i w:val="0"/>
         </w:rPr>
-        <w:t>where k_RDS is the Arrhenius rate constant for the formate formation step. To capture the Sabatier principle, a Brønsted-Evans-Polanyi (BEP) penalty was applied to the RDS barrier for catalysts with binding energies stronger than the optimal value (Eq. 6):</w:t>
+        <w:t>where k_RDS is the Arrhenius rate constant for the formate formation step. To capture the Sabatier principle, a Brønsted-Evans-Polanyi (BEP) penalty was applied to the RDS barrier for catalysts that bind intermediates more strongly than the optimal value (Eq. 6):</w:t>
       </w:r>
     </w:p>
     <w:p>
@@ -687,7 +662,7 @@
           <w:b w:val="0"/>
           <w:i w:val="0"/>
         </w:rPr>
-        <w:t>where γ is the BEP slope (0.7 for CO₂, 0.5 for H) and E_opt is the optimal binding energy. This formulation generates the classic volcano shape in descriptor space.</w:t>
+        <w:t>where γ is the BEP slope (0.7 for CO₂, 0.5 for H) and E_opt is the optimal binding energy. This formulation reproduces the classic volcano shape in descriptor space.</w:t>
       </w:r>
     </w:p>
     <w:p>
@@ -699,7 +674,7 @@
           <w:rFonts w:ascii="Times New Roman" w:hAnsi="Times New Roman"/>
           <w:color w:val="1F3A6E"/>
         </w:rPr>
-        <w:t>3.3 Degree of Rate Control (DRC)</w:t>
+        <w:t>3.3 Rate-Determining Step Identification</w:t>
       </w:r>
     </w:p>
     <w:p>
@@ -708,27 +683,7 @@
           <w:b w:val="0"/>
           <w:i w:val="0"/>
         </w:rPr>
-        <w:t>The rate-determining step was identified using the degree of rate control analysis introduced by Campbell (2017). The DRC of each elementary step i is defined by Eq. 7:</w:t>
-      </w:r>
-    </w:p>
-    <w:p>
-      <w:pPr>
-        <w:jc w:val="center"/>
-      </w:pPr>
-      <w:r>
-        <w:rPr>
-          <w:i/>
-        </w:rPr>
-        <w:t>DRC_i = (∂ ln TOF / ∂ ln k_i)    (Eq. 7)</w:t>
-      </w:r>
-    </w:p>
-    <w:p>
-      <w:r>
-        <w:rPr>
-          <w:b w:val="0"/>
-          <w:i w:val="0"/>
-        </w:rPr>
-        <w:t>A step with DRC ≈ 1 is fully rate-limiting; steps with DRC ≈ 0 are at quasi-equilibrium. This provides a rigorous criterion for identifying the rate-determining step.</w:t>
+        <w:t>The rate-determining step was identified by inspection of the analytical rate expression and confirmed by published DFT studies of CO₂ hydrogenation on Cu surfaces (Grabow &amp; Mavrikakis, 2011; Studt et al., 2014). In the formate pathway, the hydrogenation of adsorbed CO₂ to form formate (CO₂* + H* → HCOO*) is universally reported as the slowest step. The analytical TOF expression depends explicitly on k_RDS, reflecting that this step controls the overall rate. A full numerical DRC analysis would require solving the complete coupled steady-state system, which is recommended as future work.</w:t>
       </w:r>
     </w:p>
     <w:p>
@@ -749,7 +704,7 @@
           <w:b w:val="0"/>
           <w:i w:val="0"/>
         </w:rPr>
-        <w:t>Adsorption energies and activation barriers were taken from published DFT studies of CO₂ hydrogenation on Cu-based catalysts. Specifically, energies for Cu(111) were adopted from Grabow &amp; Mavrikakis (2011), while descriptor shifts representing Cu/ZnO, In₂O₃, Pd, and Ni-Ga were derived from the literature using reported scaling relations.</w:t>
+        <w:t>Adsorption energies and activation barriers were taken from published DFT studies of CO₂ hydrogenation on Cu-based catalysts. Values for Cu(111) were adopted from Grabow &amp; Mavrikakis (2011). Descriptor shifts representing Cu/ZnO, In₂O₃, Pd(111), and Ni-Ga were derived from reported scaling relations in the literature (Studt et al., 2014; Ye et al., 2013).</w:t>
       </w:r>
     </w:p>
     <w:p>
@@ -770,7 +725,7 @@
           <w:b w:val="0"/>
           <w:i w:val="0"/>
         </w:rPr>
-        <w:t>A plug-flow reactor (PFR) model was constructed to translate the microkinetic activity into realistic per-pass methanol yields. The reactor was modeled at industrial conditions (8 m length, 3 m diameter, GHSV = 10,000 h⁻¹) with feed composition H₂:CO₂ = 3:1 and an inert balance. The equilibrium conversion was computed using Cantera and compared with the kinetic approach.</w:t>
+        <w:t>A plug-flow reactor (PFR) model was constructed to translate the microkinetic activity into realistic per-pass methanol yields. The reactor was modeled at industrial conditions (8 m length, 3 m diameter, GHSV = 10,000 h⁻¹) with feed composition H₂:CO₂ = 3:1 and an inert balance. The reactor is assumed to be isothermal and isobaric. The equilibrium conversion is computed using Cantera; a kinetic efficiency factor of 0.15 is used to convert the equilibrium limit into a realistic per-pass yield, consistent with reported industrial Cu/ZnO/Al₂O₃ performance.</w:t>
       </w:r>
     </w:p>
     <w:p>
@@ -803,7 +758,7 @@
           <w:b w:val="0"/>
           <w:i w:val="0"/>
         </w:rPr>
-        <w:t>At the standard operating conditions (T = 500 K, P = 50 bar, H₂:CO₂ = 3:1), the analytical microkinetic model predicts an H*-dominated surface with the following coverages: θ_H ≈ 0.946, θ_CO₂ ≈ 0.053, and θ* ≈ 0.0005. This is consistent with experimental observations that Cu-based methanol synthesis catalysts operate under a hydrogen-rich atmosphere. The corresponding methanol TOF on Cu/ZnO is 3.49 × 10³ s⁻¹ with a methanol selectivity of 99.99%.</w:t>
+        <w:t>At the standard operating conditions (T = 500 K, P = 50 bar, H₂:CO₂ = 3:1), the analytical microkinetic model predicts an H*-dominated surface with coverages θ_H ≈ 0.946, θ_CO₂ ≈ 0.053, and θ* ≈ 0.0005. This is consistent with experimental observations that Cu-based methanol synthesis catalysts operate under a hydrogen-rich atmosphere. The corresponding methanol TOF on Cu/ZnO is 3.49 × 10³ s⁻¹ with a methanol selectivity of 99.99%.</w:t>
       </w:r>
     </w:p>
     <w:p>
@@ -824,7 +779,7 @@
           <w:b w:val="0"/>
           <w:i w:val="0"/>
         </w:rPr>
-        <w:t>Figure 1 presents the Sabatier volcano plot generated by scanning the turnover frequency over a two-dimensional descriptor space of ΔE_CO₂ and ΔE_H relative to Cu(111). The plot reveals a clear volcano peak at ΔE_CO₂ = −0.15 eV and ΔE_H = −0.03 eV, corresponding to the optimal binding energies for maximum methanol production. Catalysts located near the peak should exhibit high activity, while those far from the peak are either too weakly (low coverage) or too strongly (poisoned) bound.</w:t>
+        <w:t>Figure 1 presents the Sabatier volcano plot generated by scanning the turnover frequency over a two-dimensional descriptor space of ΔE_CO₂ and ΔE_H relative to Cu(111). The plot reveals a clear volcano peak at ΔE_CO₂ = −0.15 eV and ΔE_H = −0.03 eV. Cu/ZnO (at ΔE_CO₂ = −0.10 eV, ΔE_H = −0.05 eV) is closest to the volcano peak in Euclidean distance (0.054 eV), which is consistent with its highest predicted TOF.</w:t>
       </w:r>
     </w:p>
     <w:p>
@@ -896,7 +851,7 @@
           <w:b w:val="0"/>
           <w:i w:val="0"/>
         </w:rPr>
-        <w:t>Table 1 summarizes the descriptor shifts, Sabatier penalties, turnover frequencies, and methanol selectivities for the five catalysts considered in this study. Cu/ZnO exhibits the highest TOF and is closest to the volcano peak, consistent with its industrial use for methanol synthesis.</w:t>
+        <w:t>Table 1 summarizes the descriptor shifts, Sabatier penalties, turnover frequencies, and methanol selectivities for the five catalysts considered in this study.</w:t>
       </w:r>
     </w:p>
     <w:tbl>
@@ -1563,7 +1518,7 @@
           <w:b w:val="0"/>
           <w:i w:val="0"/>
         </w:rPr>
-        <w:t>Notably, In₂O₃ is geometrically closest to the volcano peak in descriptor space but has a lower TOF than Cu/ZnO due to the Sabatier penalty acting on its strongly bound CO₂. Pd(111) has both weak CO₂ binding and moderately strong H binding, placing it far from the optimum and resulting in a low TOF of 8 s⁻¹. This result underscores an important principle: proximity to the volcano peak in descriptor space does not automatically translate into high activity, because the RDS barrier is also affected by the strength of binding.</w:t>
+        <w:t>Cu/ZnO exhibits the highest TOF and the highest methanol selectivity, consistent with its industrial use for methanol synthesis. Although In₂O₃ is often reported to bind CO₂ more strongly than Cu surfaces, our descriptor analysis shows that this stronger binding triggers a Sabatier penalty (0.035 eV), reducing its predicted activity relative to Cu/ZnO. Pd(111) has both weak CO₂ binding and moderately strong H binding, placing it further from the optimum and resulting in a much lower TOF.</w:t>
       </w:r>
     </w:p>
     <w:p>
@@ -1575,7 +1530,7 @@
           <w:rFonts w:ascii="Times New Roman" w:hAnsi="Times New Roman"/>
           <w:color w:val="1F3A6E"/>
         </w:rPr>
-        <w:t>4.4 Degree of Rate Control Analysis</w:t>
+        <w:t>4.4 Rate-Determining Step Analysis</w:t>
       </w:r>
     </w:p>
     <w:p>
@@ -1584,429 +1539,7 @@
           <w:b w:val="0"/>
           <w:i w:val="0"/>
         </w:rPr>
-        <w:t>The degree of rate control (DRC) analysis for Cu/ZnO is summarized in Table 2. The formate formation step (CO₂* + H* → HCOO*) has DRC = 1.00, identifying it unambiguously as the rate-determining step. All other elementary steps have DRC values below 0.01, meaning they are essentially at quasi-equilibrium.</w:t>
-      </w:r>
-    </w:p>
-    <w:tbl>
-      <w:tblPr>
-        <w:tblStyle w:val="LightGrid-Accent1"/>
-        <w:tblW w:type="auto" w:w="0"/>
-        <w:jc w:val="center"/>
-        <w:tblLook w:firstColumn="1" w:firstRow="1" w:lastColumn="0" w:lastRow="0" w:noHBand="0" w:noVBand="1" w:val="04A0"/>
-      </w:tblPr>
-      <w:tblGrid>
-        <w:gridCol w:w="4320"/>
-        <w:gridCol w:w="4320"/>
-      </w:tblGrid>
-      <w:tr>
-        <w:tc>
-          <w:tcPr>
-            <w:tcW w:type="dxa" w:w="4320"/>
-          </w:tcPr>
-          <w:p>
-            <w:pPr>
-              <w:jc w:val="center"/>
-            </w:pPr>
-            <w:r/>
-            <w:r>
-              <w:rPr>
-                <w:rFonts w:ascii="Times New Roman" w:hAnsi="Times New Roman"/>
-                <w:b/>
-              </w:rPr>
-              <w:t>Elementary Step</w:t>
-            </w:r>
-          </w:p>
-        </w:tc>
-        <w:tc>
-          <w:tcPr>
-            <w:tcW w:type="dxa" w:w="4320"/>
-          </w:tcPr>
-          <w:p>
-            <w:pPr>
-              <w:jc w:val="center"/>
-            </w:pPr>
-            <w:r/>
-            <w:r>
-              <w:rPr>
-                <w:rFonts w:ascii="Times New Roman" w:hAnsi="Times New Roman"/>
-                <w:b/>
-              </w:rPr>
-              <w:t>DRC</w:t>
-            </w:r>
-          </w:p>
-        </w:tc>
-      </w:tr>
-      <w:tr>
-        <w:tc>
-          <w:tcPr>
-            <w:tcW w:type="dxa" w:w="4320"/>
-          </w:tcPr>
-          <w:p>
-            <w:pPr>
-              <w:jc w:val="center"/>
-            </w:pPr>
-            <w:r/>
-            <w:r>
-              <w:rPr>
-                <w:rFonts w:ascii="Times New Roman" w:hAnsi="Times New Roman"/>
-              </w:rPr>
-              <w:t>HCOO_formation (CO₂* + H* → HCOO*)</w:t>
-            </w:r>
-          </w:p>
-        </w:tc>
-        <w:tc>
-          <w:tcPr>
-            <w:tcW w:type="dxa" w:w="4320"/>
-          </w:tcPr>
-          <w:p>
-            <w:pPr>
-              <w:jc w:val="center"/>
-            </w:pPr>
-            <w:r/>
-            <w:r>
-              <w:rPr>
-                <w:rFonts w:ascii="Times New Roman" w:hAnsi="Times New Roman"/>
-              </w:rPr>
-              <w:t>1.000</w:t>
-            </w:r>
-          </w:p>
-        </w:tc>
-      </w:tr>
-      <w:tr>
-        <w:tc>
-          <w:tcPr>
-            <w:tcW w:type="dxa" w:w="4320"/>
-          </w:tcPr>
-          <w:p>
-            <w:pPr>
-              <w:jc w:val="center"/>
-            </w:pPr>
-            <w:r/>
-            <w:r>
-              <w:rPr>
-                <w:rFonts w:ascii="Times New Roman" w:hAnsi="Times New Roman"/>
-              </w:rPr>
-              <w:t>CO₂_adsorption</w:t>
-            </w:r>
-          </w:p>
-        </w:tc>
-        <w:tc>
-          <w:tcPr>
-            <w:tcW w:type="dxa" w:w="4320"/>
-          </w:tcPr>
-          <w:p>
-            <w:pPr>
-              <w:jc w:val="center"/>
-            </w:pPr>
-            <w:r/>
-            <w:r>
-              <w:rPr>
-                <w:rFonts w:ascii="Times New Roman" w:hAnsi="Times New Roman"/>
-              </w:rPr>
-              <w:t>−0.000</w:t>
-            </w:r>
-          </w:p>
-        </w:tc>
-      </w:tr>
-      <w:tr>
-        <w:tc>
-          <w:tcPr>
-            <w:tcW w:type="dxa" w:w="4320"/>
-          </w:tcPr>
-          <w:p>
-            <w:pPr>
-              <w:jc w:val="center"/>
-            </w:pPr>
-            <w:r/>
-            <w:r>
-              <w:rPr>
-                <w:rFonts w:ascii="Times New Roman" w:hAnsi="Times New Roman"/>
-              </w:rPr>
-              <w:t>H₂_dissociative_adsorption</w:t>
-            </w:r>
-          </w:p>
-        </w:tc>
-        <w:tc>
-          <w:tcPr>
-            <w:tcW w:type="dxa" w:w="4320"/>
-          </w:tcPr>
-          <w:p>
-            <w:pPr>
-              <w:jc w:val="center"/>
-            </w:pPr>
-            <w:r/>
-            <w:r>
-              <w:rPr>
-                <w:rFonts w:ascii="Times New Roman" w:hAnsi="Times New Roman"/>
-              </w:rPr>
-              <w:t>−0.000</w:t>
-            </w:r>
-          </w:p>
-        </w:tc>
-      </w:tr>
-      <w:tr>
-        <w:tc>
-          <w:tcPr>
-            <w:tcW w:type="dxa" w:w="4320"/>
-          </w:tcPr>
-          <w:p>
-            <w:pPr>
-              <w:jc w:val="center"/>
-            </w:pPr>
-            <w:r/>
-            <w:r>
-              <w:rPr>
-                <w:rFonts w:ascii="Times New Roman" w:hAnsi="Times New Roman"/>
-              </w:rPr>
-              <w:t>H₂COO_formation</w:t>
-            </w:r>
-          </w:p>
-        </w:tc>
-        <w:tc>
-          <w:tcPr>
-            <w:tcW w:type="dxa" w:w="4320"/>
-          </w:tcPr>
-          <w:p>
-            <w:pPr>
-              <w:jc w:val="center"/>
-            </w:pPr>
-            <w:r/>
-            <w:r>
-              <w:rPr>
-                <w:rFonts w:ascii="Times New Roman" w:hAnsi="Times New Roman"/>
-              </w:rPr>
-              <w:t>−0.000</w:t>
-            </w:r>
-          </w:p>
-        </w:tc>
-      </w:tr>
-      <w:tr>
-        <w:tc>
-          <w:tcPr>
-            <w:tcW w:type="dxa" w:w="4320"/>
-          </w:tcPr>
-          <w:p>
-            <w:pPr>
-              <w:jc w:val="center"/>
-            </w:pPr>
-            <w:r/>
-            <w:r>
-              <w:rPr>
-                <w:rFonts w:ascii="Times New Roman" w:hAnsi="Times New Roman"/>
-              </w:rPr>
-              <w:t>H₂CO_formation</w:t>
-            </w:r>
-          </w:p>
-        </w:tc>
-        <w:tc>
-          <w:tcPr>
-            <w:tcW w:type="dxa" w:w="4320"/>
-          </w:tcPr>
-          <w:p>
-            <w:pPr>
-              <w:jc w:val="center"/>
-            </w:pPr>
-            <w:r/>
-            <w:r>
-              <w:rPr>
-                <w:rFonts w:ascii="Times New Roman" w:hAnsi="Times New Roman"/>
-              </w:rPr>
-              <w:t>−0.000</w:t>
-            </w:r>
-          </w:p>
-        </w:tc>
-      </w:tr>
-      <w:tr>
-        <w:tc>
-          <w:tcPr>
-            <w:tcW w:type="dxa" w:w="4320"/>
-          </w:tcPr>
-          <w:p>
-            <w:pPr>
-              <w:jc w:val="center"/>
-            </w:pPr>
-            <w:r/>
-            <w:r>
-              <w:rPr>
-                <w:rFonts w:ascii="Times New Roman" w:hAnsi="Times New Roman"/>
-              </w:rPr>
-              <w:t>H₃CO_formation</w:t>
-            </w:r>
-          </w:p>
-        </w:tc>
-        <w:tc>
-          <w:tcPr>
-            <w:tcW w:type="dxa" w:w="4320"/>
-          </w:tcPr>
-          <w:p>
-            <w:pPr>
-              <w:jc w:val="center"/>
-            </w:pPr>
-            <w:r/>
-            <w:r>
-              <w:rPr>
-                <w:rFonts w:ascii="Times New Roman" w:hAnsi="Times New Roman"/>
-              </w:rPr>
-              <w:t>−0.000</w:t>
-            </w:r>
-          </w:p>
-        </w:tc>
-      </w:tr>
-      <w:tr>
-        <w:tc>
-          <w:tcPr>
-            <w:tcW w:type="dxa" w:w="4320"/>
-          </w:tcPr>
-          <w:p>
-            <w:pPr>
-              <w:jc w:val="center"/>
-            </w:pPr>
-            <w:r/>
-            <w:r>
-              <w:rPr>
-                <w:rFonts w:ascii="Times New Roman" w:hAnsi="Times New Roman"/>
-              </w:rPr>
-              <w:t>CH₃OH_formation</w:t>
-            </w:r>
-          </w:p>
-        </w:tc>
-        <w:tc>
-          <w:tcPr>
-            <w:tcW w:type="dxa" w:w="4320"/>
-          </w:tcPr>
-          <w:p>
-            <w:pPr>
-              <w:jc w:val="center"/>
-            </w:pPr>
-            <w:r/>
-            <w:r>
-              <w:rPr>
-                <w:rFonts w:ascii="Times New Roman" w:hAnsi="Times New Roman"/>
-              </w:rPr>
-              <w:t>−0.000</w:t>
-            </w:r>
-          </w:p>
-        </w:tc>
-      </w:tr>
-      <w:tr>
-        <w:tc>
-          <w:tcPr>
-            <w:tcW w:type="dxa" w:w="4320"/>
-          </w:tcPr>
-          <w:p>
-            <w:pPr>
-              <w:jc w:val="center"/>
-            </w:pPr>
-            <w:r/>
-            <w:r>
-              <w:rPr>
-                <w:rFonts w:ascii="Times New Roman" w:hAnsi="Times New Roman"/>
-              </w:rPr>
-              <w:t>CH₃OH_desorption</w:t>
-            </w:r>
-          </w:p>
-        </w:tc>
-        <w:tc>
-          <w:tcPr>
-            <w:tcW w:type="dxa" w:w="4320"/>
-          </w:tcPr>
-          <w:p>
-            <w:pPr>
-              <w:jc w:val="center"/>
-            </w:pPr>
-            <w:r/>
-            <w:r>
-              <w:rPr>
-                <w:rFonts w:ascii="Times New Roman" w:hAnsi="Times New Roman"/>
-              </w:rPr>
-              <w:t>−0.000</w:t>
-            </w:r>
-          </w:p>
-        </w:tc>
-      </w:tr>
-      <w:tr>
-        <w:tc>
-          <w:tcPr>
-            <w:tcW w:type="dxa" w:w="4320"/>
-          </w:tcPr>
-          <w:p>
-            <w:pPr>
-              <w:jc w:val="center"/>
-            </w:pPr>
-            <w:r/>
-            <w:r>
-              <w:rPr>
-                <w:rFonts w:ascii="Times New Roman" w:hAnsi="Times New Roman"/>
-              </w:rPr>
-              <w:t>RWGS_CO₂_dissociation</w:t>
-            </w:r>
-          </w:p>
-        </w:tc>
-        <w:tc>
-          <w:tcPr>
-            <w:tcW w:type="dxa" w:w="4320"/>
-          </w:tcPr>
-          <w:p>
-            <w:pPr>
-              <w:jc w:val="center"/>
-            </w:pPr>
-            <w:r/>
-            <w:r>
-              <w:rPr>
-                <w:rFonts w:ascii="Times New Roman" w:hAnsi="Times New Roman"/>
-              </w:rPr>
-              <w:t>−0.000</w:t>
-            </w:r>
-          </w:p>
-        </w:tc>
-      </w:tr>
-      <w:tr>
-        <w:tc>
-          <w:tcPr>
-            <w:tcW w:type="dxa" w:w="4320"/>
-          </w:tcPr>
-          <w:p>
-            <w:pPr>
-              <w:jc w:val="center"/>
-            </w:pPr>
-            <w:r/>
-            <w:r>
-              <w:rPr>
-                <w:rFonts w:ascii="Times New Roman" w:hAnsi="Times New Roman"/>
-              </w:rPr>
-              <w:t>All other steps</w:t>
-            </w:r>
-          </w:p>
-        </w:tc>
-        <w:tc>
-          <w:tcPr>
-            <w:tcW w:type="dxa" w:w="4320"/>
-          </w:tcPr>
-          <w:p>
-            <w:pPr>
-              <w:jc w:val="center"/>
-            </w:pPr>
-            <w:r/>
-            <w:r>
-              <w:rPr>
-                <w:rFonts w:ascii="Times New Roman" w:hAnsi="Times New Roman"/>
-              </w:rPr>
-              <w:t>−0.000</w:t>
-            </w:r>
-          </w:p>
-        </w:tc>
-      </w:tr>
-    </w:tbl>
-    <w:p>
-      <w:pPr>
-        <w:jc w:val="center"/>
-      </w:pPr>
-      <w:r>
-        <w:rPr>
-          <w:i/>
-          <w:sz w:val="20"/>
-        </w:rPr>
-        <w:t>Table 2. Degree of Rate Control for Cu/ZnO at 500 K, 50 bar.</w:t>
+        <w:t>The analytical rate expression shows that the TOF depends explicitly on the formate formation rate constant (k_RDS). This, combined with prior DFT studies, unambiguously identifies the formate formation step (CO₂* + H* → HCOO*) as the rate-determining step. In the analytical model, the partial derivative of ln(TOF) with respect to ln(k_RDS) is 1.0 by construction; other elementary steps do not appear in the analytical rate expression, so their analytical sensitivities are zero. This simplified behavior reflects the approximation inherent in the analytical model, and a full DRC analysis using the complete 13-step steady-state system is recommended as future work.</w:t>
       </w:r>
     </w:p>
     <w:p>
@@ -2027,7 +1560,7 @@
           <w:b w:val="0"/>
           <w:i w:val="0"/>
         </w:rPr>
-        <w:t>Figure 2 shows the temperature sensitivity analysis. The TOF increases with temperature following Arrhenius behavior, with Cu/ZnO consistently exhibiting the highest activity across the entire 400–700 K range. The apparent activation energy extracted from the Arrhenius plot is 917 meV for Cu/ZnO, the lowest among the catalysts studied. Pd(111) has the highest apparent activation energy (1224 meV), consistent with its poor activity.</w:t>
+        <w:t>Figure 2 shows the temperature sensitivity analysis. The TOF increases with temperature following Arrhenius behavior, with Cu/ZnO consistently exhibiting the highest activity across the entire 400–700 K range. The apparent activation energy extracted from the Arrhenius plot is 917 meV for Cu/ZnO, the lowest among the catalysts studied. Pd(111) has the highest apparent activation energy (1224 meV), consistent with its poorer predicted activity.</w:t>
       </w:r>
     </w:p>
     <w:p>
@@ -2099,7 +1632,7 @@
           <w:b w:val="0"/>
           <w:i w:val="0"/>
         </w:rPr>
-        <w:t>Figure 3 shows the results of the plug-flow reactor model. The axial composition profile for Cu/ZnO (Figure 3a) shows progressive conversion of CO₂ and H₂ to methanol along the reactor length. Cu/ZnO achieves the highest methanol yield among the screened catalysts (Figure 3b). The temperature and pressure parametric studies reveal that (i) methanol yield increases with pressure due to Le Chatelier's principle, and (ii) there is an optimal temperature around 560 K that balances kinetic acceleration against thermodynamic limitations.</w:t>
+        <w:t>Figure 3 shows the results of the plug-flow reactor model. The axial composition profile for Cu/ZnO (Figure 3a) shows progressive conversion of CO₂ and H₂ to methanol along the reactor length. Cu/ZnO achieves the highest methanol yield among the screened catalysts (Figure 3b). The temperature and pressure parametric studies (Figure 3c,d) reveal that (i) methanol yield increases with pressure due to Le Chatelier's principle, and (ii) there is an optimal temperature around 560 K that balances kinetic acceleration against thermodynamic limitations.</w:t>
       </w:r>
     </w:p>
     <w:p>
@@ -2150,7 +1683,7 @@
           <w:i/>
           <w:sz w:val="20"/>
         </w:rPr>
-        <w:t>Figure 3. PFR reactor analysis. (a) Axial profile for Cu/ZnO, (b) catalyst comparison, (c) effect of temperature, (d) effect of pressure.</w:t>
+        <w:t>Figure 3. PFR reactor analysis. (a) Axial profile for Cu/ZnO, (b) catalyst comparison of methanol yield, (c) effect of temperature, (d) effect of pressure.</w:t>
       </w:r>
     </w:p>
     <w:p>
@@ -2171,7 +1704,7 @@
           <w:b w:val="0"/>
           <w:i w:val="0"/>
         </w:rPr>
-        <w:t>The volcano plot, DRC analysis, and reactor model together provide the following design rules for developing improved catalysts for CO₂ hydrogenation to methanol:</w:t>
+        <w:t>The volcano plot, RDS analysis, and reactor model together provide the following design rules for developing improved catalysts for CO₂ hydrogenation to methanol:</w:t>
       </w:r>
     </w:p>
     <w:p>
@@ -2179,13 +1712,7 @@
         <w:pStyle w:val="ListBullet"/>
       </w:pPr>
       <w:r>
-        <w:rPr>
-          <w:b/>
-        </w:rPr>
-        <w:t>Rule 1 (Optimal CO₂ binding):</w:t>
-      </w:r>
-      <w:r>
-        <w:t xml:space="preserve"> The optimal CO₂ binding energy lies at ΔE_CO₂ ≈ −0.15 eV relative to Cu(111). Catalysts that bind CO₂ significantly more strongly will suffer from Sabatier penalties and lower activity.</w:t>
+        <w:t>Rule 1 (Optimal CO₂ binding): The optimal CO₂ binding energy lies at ΔE_CO₂ ≈ −0.15 eV relative to Cu(111). Catalysts that bind CO₂ significantly more strongly will suffer from Sabatier penalties and lower activity.</w:t>
       </w:r>
     </w:p>
     <w:p>
@@ -2193,13 +1720,7 @@
         <w:pStyle w:val="ListBullet"/>
       </w:pPr>
       <w:r>
-        <w:rPr>
-          <w:b/>
-        </w:rPr>
-        <w:t>Rule 2 (Optimal H binding):</w:t>
-      </w:r>
-      <w:r>
-        <w:t xml:space="preserve"> The optimal H binding energy is approximately ΔE_H ≈ 0 eV relative to Cu(111). Hydrogen must be bound strongly enough to maintain high surface coverage but weakly enough to allow hydrogenation.</w:t>
+        <w:t>Rule 2 (Optimal H binding): The optimal H binding energy is approximately ΔE_H ≈ 0 eV relative to Cu(111). Hydrogen must be bound strongly enough to maintain high surface coverage but weakly enough to allow hydrogenation.</w:t>
       </w:r>
     </w:p>
     <w:p>
@@ -2207,13 +1728,7 @@
         <w:pStyle w:val="ListBullet"/>
       </w:pPr>
       <w:r>
-        <w:rPr>
-          <w:b/>
-        </w:rPr>
-        <w:t>Rule 3 (Rate-determining step):</w:t>
-      </w:r>
-      <w:r>
-        <w:t xml:space="preserve"> The formate formation step (CO₂* + H* → HCOO*) is universally rate-limiting across the descriptor space. Catalysts that stabilize the formate transition state relative to the reactant state will exhibit higher activity.</w:t>
+        <w:t>Rule 3 (Rate-determining step): The formate formation step (CO₂* + H* → HCOO*) is universally rate-limiting across the descriptor space. Catalysts that stabilize the formate transition state relative to the reactant state will exhibit higher activity.</w:t>
       </w:r>
     </w:p>
     <w:p>
@@ -2221,13 +1736,7 @@
         <w:pStyle w:val="ListBullet"/>
       </w:pPr>
       <w:r>
-        <w:rPr>
-          <w:b/>
-        </w:rPr>
-        <w:t>Rule 4 (Reactor conditions):</w:t>
-      </w:r>
-      <w:r>
-        <w:t xml:space="preserve"> The optimal operating condition balances kinetic acceleration against thermodynamic reversibility. The model predicts an optimum around T = 560 K and P = 80–100 bar.</w:t>
+        <w:t>Rule 4 (Reactor conditions): The optimal operating condition balances kinetic acceleration against thermodynamic reversibility. The model predicts an optimum around T = 560 K and P = 80–100 bar.</w:t>
       </w:r>
     </w:p>
     <w:p>
@@ -2235,13 +1744,7 @@
         <w:pStyle w:val="ListBullet"/>
       </w:pPr>
       <w:r>
-        <w:rPr>
-          <w:b/>
-        </w:rPr>
-        <w:t>Rule 5 (Validation):</w:t>
-      </w:r>
-      <w:r>
-        <w:t xml:space="preserve"> The close agreement between model predictions and industrial data for Cu/ZnO validates the model's predictive capability and provides confidence in the design rules derived from it.</w:t>
+        <w:t>Rule 5 (Validation): The agreement between model predictions and industrial data for Cu/ZnO validates the model's qualitative predictive capability and provides confidence in the design rules derived from it.</w:t>
       </w:r>
     </w:p>
     <w:p>
@@ -2270,7 +1773,7 @@
         <w:pStyle w:val="ListBullet"/>
       </w:pPr>
       <w:r>
-        <w:t xml:space="preserve"> A 13-step elementary reaction mechanism following the formate pathway was constructed and implemented in an analytical Langmuir-Hinshelwood framework.</w:t>
+        <w:t>A 13-step elementary reaction mechanism following the formate pathway was constructed and implemented in an analytical Langmuir-Hinshelwood framework.</w:t>
       </w:r>
     </w:p>
     <w:p>
@@ -2278,7 +1781,7 @@
         <w:pStyle w:val="ListBullet"/>
       </w:pPr>
       <w:r>
-        <w:t xml:space="preserve"> The model predicts H* as the dominant surface species (θ_H ≈ 0.95), consistent with experimental observations.</w:t>
+        <w:t>The model predicts H* as the dominant surface species (θ_H ≈ 0.95), consistent with experimental observations.</w:t>
       </w:r>
     </w:p>
     <w:p>
@@ -2286,7 +1789,7 @@
         <w:pStyle w:val="ListBullet"/>
       </w:pPr>
       <w:r>
-        <w:t xml:space="preserve"> A Sabatier volcano plot identified the optimal descriptor values at ΔE_CO₂ = −0.15 eV and ΔE_H = −0.03 eV.</w:t>
+        <w:t>A Sabatier volcano plot identified the optimal descriptor values at ΔE_CO₂ = −0.15 eV and ΔE_H = −0.03 eV. Cu/ZnO lies closest to the peak and exhibits the highest predicted TOF.</w:t>
       </w:r>
     </w:p>
     <w:p>
@@ -2294,7 +1797,7 @@
         <w:pStyle w:val="ListBullet"/>
       </w:pPr>
       <w:r>
-        <w:t xml:space="preserve"> Cu/ZnO is predicted to be the best catalyst among the five screened, with TOF = 3.49 × 10³ s⁻¹ and 99.99% selectivity — consistent with its use in industrial methanol synthesis.</w:t>
+        <w:t>Cu/ZnO is predicted to be the best catalyst among the five screened, with TOF = 3.49 × 10³ s⁻¹ and 99.99% selectivity — consistent with its use in industrial methanol synthesis.</w:t>
       </w:r>
     </w:p>
     <w:p>
@@ -2302,7 +1805,7 @@
         <w:pStyle w:val="ListBullet"/>
       </w:pPr>
       <w:r>
-        <w:t xml:space="preserve"> Formate formation is the rate-determining step, with a Degree of Rate Control of 1.00.</w:t>
+        <w:t>Formate formation is identified as the rate-determining step by both the analytical rate expression and prior DFT studies.</w:t>
       </w:r>
     </w:p>
     <w:p>
@@ -2310,7 +1813,7 @@
         <w:pStyle w:val="ListBullet"/>
       </w:pPr>
       <w:r>
-        <w:t xml:space="preserve"> Apparent activation energies range from 917 meV (Cu/ZnO) to 1224 meV (Pd(111)), correlating with catalyst activity.</w:t>
+        <w:t>Apparent activation energies range from 917 meV (Cu/ZnO) to 1224 meV (Pd(111)), correlating with catalyst activity.</w:t>
       </w:r>
     </w:p>
     <w:p>
@@ -2318,7 +1821,7 @@
         <w:pStyle w:val="ListBullet"/>
       </w:pPr>
       <w:r>
-        <w:t xml:space="preserve"> The plug-flow reactor model predicts realistic per-pass methanol yields and identifies an optimal operating temperature of ~560 K.</w:t>
+        <w:t>The plug-flow reactor model predicts realistic per-pass methanol yields and identifies an optimal operating temperature of ~560 K.</w:t>
       </w:r>
     </w:p>
     <w:p>
@@ -2327,7 +1830,7 @@
           <w:b w:val="0"/>
           <w:i w:val="0"/>
         </w:rPr>
-        <w:t>The combined microkinetic-reactor workflow developed here can be extended to other CO₂ hydrogenation reactions and other catalyst families. Future work should focus on: (i) incorporating adsorbate-adsorbate interactions for higher accuracy at industrial coverages, (ii) extending the descriptor space to include structural effects such as surface step density, and (iii) validating the design rules through direct experimental measurements on the proposed optimal catalysts.</w:t>
+        <w:t>The combined microkinetic-reactor workflow developed here can be extended to other CO₂ hydrogenation reactions and other catalyst families. Future work should focus on: (i) a full numerical solution of the coupled 13-step steady-state system to enable an independent DRC analysis, (ii) incorporating adsorbate-adsorbate interactions for higher accuracy at industrial coverages, (iii) extending the descriptor space to include structural effects such as surface step density, and (iv) validating the design rules through direct experimental measurements.</w:t>
       </w:r>
     </w:p>
     <w:p>

</xml_diff>